<commit_message>
Co-authored-by: Hajrah143 <Hajrah143@users.noreply.github.com> Co-authored-by: ZYUXI22 <ZYUXI22@users.noreply.github.com>
</commit_message>
<xml_diff>
--- a/Docs/FEDCA2Distribution.docx
+++ b/Docs/FEDCA2Distribution.docx
@@ -112,16 +112,8 @@
               <w:rPr>
                 <w:color w:val="EE0000"/>
               </w:rPr>
-              <w:t xml:space="preserve">HTML and </w:t>
-            </w:r>
-            <w:proofErr w:type="spellStart"/>
-            <w:r>
-              <w:rPr>
-                <w:color w:val="EE0000"/>
-              </w:rPr>
-              <w:t>Javascript</w:t>
-            </w:r>
-            <w:proofErr w:type="spellEnd"/>
+              <w:t>HTML and Javascript</w:t>
+            </w:r>
           </w:p>
         </w:tc>
         <w:tc>
@@ -208,7 +200,13 @@
               <w:rPr>
                 <w:color w:val="4EA72E" w:themeColor="accent6"/>
               </w:rPr>
-              <w:t>75%</w:t>
+              <w:t>8</w:t>
+            </w:r>
+            <w:r>
+              <w:rPr>
+                <w:color w:val="4EA72E" w:themeColor="accent6"/>
+              </w:rPr>
+              <w:t>5%</w:t>
             </w:r>
           </w:p>
           <w:p>
@@ -371,16 +369,8 @@
               <w:rPr>
                 <w:color w:val="EE0000"/>
               </w:rPr>
-              <w:t xml:space="preserve">HTML and </w:t>
-            </w:r>
-            <w:proofErr w:type="spellStart"/>
-            <w:r>
-              <w:rPr>
-                <w:color w:val="EE0000"/>
-              </w:rPr>
-              <w:t>Javascript</w:t>
-            </w:r>
-            <w:proofErr w:type="spellEnd"/>
+              <w:t>HTML and Javascript</w:t>
+            </w:r>
           </w:p>
         </w:tc>
         <w:tc>
@@ -452,9 +442,20 @@
             <w:tcW w:w="1454" w:type="dxa"/>
           </w:tcPr>
           <w:p>
-            <w:r>
-              <w:rPr>
-                <w:color w:val="EE0000"/>
+            <w:pPr>
+              <w:rPr>
+                <w:color w:val="4EA72E" w:themeColor="accent6"/>
+              </w:rPr>
+            </w:pPr>
+            <w:r>
+              <w:rPr>
+                <w:color w:val="4EA72E" w:themeColor="accent6"/>
+              </w:rPr>
+              <w:t>6</w:t>
+            </w:r>
+            <w:r>
+              <w:rPr>
+                <w:color w:val="4EA72E" w:themeColor="accent6"/>
               </w:rPr>
               <w:t>0%</w:t>
             </w:r>
@@ -496,12 +497,18 @@
           <w:p>
             <w:pPr>
               <w:rPr>
-                <w:color w:val="EE0000"/>
+                <w:color w:val="4EA72E" w:themeColor="accent6"/>
               </w:rPr>
             </w:pPr>
             <w:r>
               <w:rPr>
-                <w:color w:val="EE0000"/>
+                <w:color w:val="4EA72E" w:themeColor="accent6"/>
+              </w:rPr>
+              <w:t>6</w:t>
+            </w:r>
+            <w:r>
+              <w:rPr>
+                <w:color w:val="4EA72E" w:themeColor="accent6"/>
               </w:rPr>
               <w:t>0%</w:t>
             </w:r>
@@ -518,11 +525,9 @@
             <w:vMerge w:val="restart"/>
           </w:tcPr>
           <w:p>
-            <w:proofErr w:type="spellStart"/>
             <w:r>
               <w:t>YuXi</w:t>
             </w:r>
-            <w:proofErr w:type="spellEnd"/>
           </w:p>
         </w:tc>
         <w:tc>
@@ -2294,15 +2299,6 @@
 </file>
 
 <file path=customXml/item1.xml><?xml version="1.0" encoding="utf-8"?>
-<?mso-contentType ?>
-<FormTemplates xmlns="http://schemas.microsoft.com/sharepoint/v3/contenttype/forms">
-  <Display>DocumentLibraryForm</Display>
-  <Edit>DocumentLibraryForm</Edit>
-  <New>DocumentLibraryForm</New>
-</FormTemplates>
-</file>
-
-<file path=customXml/item2.xml><?xml version="1.0" encoding="utf-8"?>
 <ct:contentTypeSchema xmlns:ct="http://schemas.microsoft.com/office/2006/metadata/contentType" xmlns:ma="http://schemas.microsoft.com/office/2006/metadata/properties/metaAttributes" ct:_="" ma:_="" ma:contentTypeName="Document" ma:contentTypeID="0x0101002285DB89E4847A46AA113B7AC5E68FC5" ma:contentTypeVersion="10" ma:contentTypeDescription="Create a new document." ma:contentTypeScope="" ma:versionID="0294ee7bac43adc269ff77be00765d0e">
   <xsd:schema xmlns:xsd="http://www.w3.org/2001/XMLSchema" xmlns:xs="http://www.w3.org/2001/XMLSchema" xmlns:p="http://schemas.microsoft.com/office/2006/metadata/properties" xmlns:ns3="f94e928f-f05d-4f43-a5ab-77664fa1059c" targetNamespace="http://schemas.microsoft.com/office/2006/metadata/properties" ma:root="true" ma:fieldsID="a23dd84f4dc29e43373820a8122fa6da" ns3:_="">
     <xsd:import namespace="f94e928f-f05d-4f43-a5ab-77664fa1059c"/>
@@ -2484,11 +2480,16 @@
 </ct:contentTypeSchema>
 </file>
 
-<file path=customXml/item3.xml><?xml version="1.0" encoding="utf-8"?>
-<b:Sources xmlns:b="http://schemas.openxmlformats.org/officeDocument/2006/bibliography" xmlns="http://schemas.openxmlformats.org/officeDocument/2006/bibliography" SelectedStyle="\APASixthEditionOfficeOnline.xsl" StyleName="APA" Version="6"/>
+<file path=customXml/item2.xml><?xml version="1.0" encoding="utf-8"?>
+<?mso-contentType ?>
+<FormTemplates xmlns="http://schemas.microsoft.com/sharepoint/v3/contenttype/forms">
+  <Display>DocumentLibraryForm</Display>
+  <Edit>DocumentLibraryForm</Edit>
+  <New>DocumentLibraryForm</New>
+</FormTemplates>
 </file>
 
-<file path=customXml/item4.xml><?xml version="1.0" encoding="utf-8"?>
+<file path=customXml/item3.xml><?xml version="1.0" encoding="utf-8"?>
 <p:properties xmlns:p="http://schemas.microsoft.com/office/2006/metadata/properties" xmlns:xsi="http://www.w3.org/2001/XMLSchema-instance" xmlns:pc="http://schemas.microsoft.com/office/infopath/2007/PartnerControls">
   <documentManagement>
     <_activity xmlns="f94e928f-f05d-4f43-a5ab-77664fa1059c" xsi:nil="true"/>
@@ -2496,15 +2497,11 @@
 </p:properties>
 </file>
 
-<file path=customXml/itemProps1.xml><?xml version="1.0" encoding="utf-8"?>
-<ds:datastoreItem xmlns:ds="http://schemas.openxmlformats.org/officeDocument/2006/customXml" ds:itemID="{82D2F0DB-0598-415E-9CF5-528049532B73}">
-  <ds:schemaRefs>
-    <ds:schemaRef ds:uri="http://schemas.microsoft.com/sharepoint/v3/contenttype/forms"/>
-  </ds:schemaRefs>
-</ds:datastoreItem>
+<file path=customXml/item4.xml><?xml version="1.0" encoding="utf-8"?>
+<b:Sources xmlns:b="http://schemas.openxmlformats.org/officeDocument/2006/bibliography" xmlns="http://schemas.openxmlformats.org/officeDocument/2006/bibliography" SelectedStyle="\APASixthEditionOfficeOnline.xsl" StyleName="APA" Version="6"/>
 </file>
 
-<file path=customXml/itemProps2.xml><?xml version="1.0" encoding="utf-8"?>
+<file path=customXml/itemProps1.xml><?xml version="1.0" encoding="utf-8"?>
 <ds:datastoreItem xmlns:ds="http://schemas.openxmlformats.org/officeDocument/2006/customXml" ds:itemID="{34793D8F-C02D-489C-8B28-41E2BD942F52}">
   <ds:schemaRefs>
     <ds:schemaRef ds:uri="http://schemas.microsoft.com/office/2006/metadata/contentType"/>
@@ -2522,15 +2519,15 @@
 </ds:datastoreItem>
 </file>
 
-<file path=customXml/itemProps3.xml><?xml version="1.0" encoding="utf-8"?>
-<ds:datastoreItem xmlns:ds="http://schemas.openxmlformats.org/officeDocument/2006/customXml" ds:itemID="{4DAA79F3-B784-435B-B2E2-76254CC37F42}">
+<file path=customXml/itemProps2.xml><?xml version="1.0" encoding="utf-8"?>
+<ds:datastoreItem xmlns:ds="http://schemas.openxmlformats.org/officeDocument/2006/customXml" ds:itemID="{82D2F0DB-0598-415E-9CF5-528049532B73}">
   <ds:schemaRefs>
-    <ds:schemaRef ds:uri="http://schemas.openxmlformats.org/officeDocument/2006/bibliography"/>
+    <ds:schemaRef ds:uri="http://schemas.microsoft.com/sharepoint/v3/contenttype/forms"/>
   </ds:schemaRefs>
 </ds:datastoreItem>
 </file>
 
-<file path=customXml/itemProps4.xml><?xml version="1.0" encoding="utf-8"?>
+<file path=customXml/itemProps3.xml><?xml version="1.0" encoding="utf-8"?>
 <ds:datastoreItem xmlns:ds="http://schemas.openxmlformats.org/officeDocument/2006/customXml" ds:itemID="{536CF66B-E0F5-4217-B073-37A78F43583C}">
   <ds:schemaRefs>
     <ds:schemaRef ds:uri="http://schemas.microsoft.com/office/2006/metadata/properties"/>
@@ -2538,4 +2535,12 @@
     <ds:schemaRef ds:uri="f94e928f-f05d-4f43-a5ab-77664fa1059c"/>
   </ds:schemaRefs>
 </ds:datastoreItem>
+</file>
+
+<file path=customXml/itemProps4.xml><?xml version="1.0" encoding="utf-8"?>
+<ds:datastoreItem xmlns:ds="http://schemas.openxmlformats.org/officeDocument/2006/customXml" ds:itemID="{4DAA79F3-B784-435B-B2E2-76254CC37F42}">
+  <ds:schemaRefs>
+    <ds:schemaRef ds:uri="http://schemas.openxmlformats.org/officeDocument/2006/bibliography"/>
+  </ds:schemaRefs>
+</ds:datastoreItem>
 </file>
</xml_diff>